<commit_message>
Upgrade Warp plugin to v1.6.7 (listener keeps cycling, repair launch fix)
Co-authored-by: Shawn M Lewis <smlsr@users.noreply.github.com>
</commit_message>
<xml_diff>
--- a/.cursor/plugins/warp/docs/Warp-Guide.docx
+++ b/.cursor/plugins/warp/docs/Warp-Guide.docx
@@ -30,7 +30,7 @@
           <w:sz w:val="20"/>
           <w:szCs w:val="20"/>
         </w:rPr>
-        <w:t xml:space="preserve">Warp 1.6.4 scans a repo for a plan, builds a schedule, and dispatches one Cursor subagent (a Shuttle) per ticket, each on its own branch and pull request. The parent agent is the only merger. You drive it from a Cursor agent window. This guide is the session, from install through stop, and where to look when something does not move. Every flag is in docs/COMMANDS.md and every config key in docs/CONFIG.md.</w:t>
+        <w:t xml:space="preserve">Warp 1.6.5 scans a repo for a plan, builds a schedule, and dispatches one Cursor subagent (a Shuttle) per ticket, each on its own branch and pull request. The parent agent is the only merger. You drive it from a Cursor agent window. This guide is the session, from install through stop, and where to look when something does not move. Every flag is in docs/COMMANDS.md and every config key in docs/CONFIG.md.</w:t>
       </w:r>
     </w:p>
     <w:p>
@@ -4781,6 +4781,17 @@
               </w:rPr>
               <w:t xml:space="preserve">claude-sonnet-5-5-high</w:t>
             </w:r>
+            <w:r>
+              <w:rPr>
+                <w:rFonts w:ascii="Calibri" w:cs="Calibri" w:eastAsia="Calibri" w:hAnsi="Calibri"/>
+                <w:b w:val="false"/>
+                <w:bCs w:val="false"/>
+                <w:color w:val="1F2A2E"/>
+                <w:sz w:val="18"/>
+                <w:szCs w:val="18"/>
+              </w:rPr>
+              <w:t xml:space="preserve"> (commented out)</w:t>
+            </w:r>
           </w:p>
         </w:tc>
         <w:tc>
@@ -4812,7 +4823,7 @@
                 <w:sz w:val="18"/>
                 <w:szCs w:val="18"/>
               </w:rPr>
-              <w:t xml:space="preserve">Coding model slug. Must match the Cursor model picker.</w:t>
+              <w:t xml:space="preserve">Every Shuttle's model unless a size line sets one. Must match the Cursor model picker.</w:t>
             </w:r>
           </w:p>
         </w:tc>
@@ -4905,7 +4916,7 @@
                 <w:sz w:val="18"/>
                 <w:szCs w:val="18"/>
               </w:rPr>
-              <w:t xml:space="preserve">empty</w:t>
+              <w:t xml:space="preserve">commented out</w:t>
             </w:r>
           </w:p>
         </w:tc>
@@ -4938,7 +4949,7 @@
                 <w:sz w:val="18"/>
                 <w:szCs w:val="18"/>
               </w:rPr>
-              <w:t xml:space="preserve">The Shuttle model for that ticket size. Empty uses </w:t>
+              <w:t xml:space="preserve">The Shuttle model for that ticket size. Unset or empty uses </w:t>
             </w:r>
             <w:r>
               <w:rPr>
@@ -5053,7 +5064,7 @@
                 <w:sz w:val="18"/>
                 <w:szCs w:val="18"/>
               </w:rPr>
-              <w:t xml:space="preserve">empty, 2</w:t>
+              <w:t xml:space="preserve">commented out, 2</w:t>
             </w:r>
           </w:p>
         </w:tc>
@@ -5086,7 +5097,7 @@
                 <w:sz w:val="18"/>
                 <w:szCs w:val="18"/>
               </w:rPr>
-              <w:t xml:space="preserve">A stronger model for a ticket's second and later fix rounds. Empty keeps the ticket's model.</w:t>
+              <w:t xml:space="preserve">A stronger model for a ticket's second and later fix rounds. Unset keeps the ticket's model.</w:t>
             </w:r>
           </w:p>
         </w:tc>
@@ -6626,6 +6637,369 @@
         </w:tc>
       </w:tr>
     </w:tbl>
+    <w:p>
+      <w:pPr>
+        <w:pStyle w:val="Heading2"/>
+        <w:keepNext/>
+        <w:spacing w:after="80" w:before="220"/>
+      </w:pPr>
+      <w:r>
+        <w:rPr>
+          <w:rFonts w:ascii="Calibri" w:cs="Calibri" w:eastAsia="Calibri" w:hAnsi="Calibri"/>
+          <w:b/>
+          <w:bCs/>
+          <w:color w:val="0B6E6E"/>
+          <w:sz w:val="25"/>
+          <w:szCs w:val="25"/>
+        </w:rPr>
+        <w:t xml:space="preserve">Shuttle models</w:t>
+      </w:r>
+    </w:p>
+    <w:p>
+      <w:pPr>
+        <w:spacing w:after="100" w:line="264"/>
+      </w:pPr>
+      <w:r>
+        <w:rPr>
+          <w:rFonts w:ascii="Calibri" w:cs="Calibri" w:eastAsia="Calibri" w:hAnsi="Calibri"/>
+          <w:color w:val="1F2A2E"/>
+          <w:sz w:val="20"/>
+          <w:szCs w:val="20"/>
+        </w:rPr>
+        <w:t xml:space="preserve">Each Shuttle starts on one model: </w:t>
+      </w:r>
+      <w:r>
+        <w:rPr>
+          <w:rFonts w:ascii="Consolas" w:cs="Consolas" w:eastAsia="Consolas" w:hAnsi="Consolas"/>
+          <w:color w:val="1F2A2E"/>
+          <w:sz w:val="18"/>
+          <w:szCs w:val="18"/>
+        </w:rPr>
+        <w:t xml:space="preserve">model&lt;Size&gt;</w:t>
+      </w:r>
+      <w:r>
+        <w:rPr>
+          <w:rFonts w:ascii="Calibri" w:cs="Calibri" w:eastAsia="Calibri" w:hAnsi="Calibri"/>
+          <w:color w:val="1F2A2E"/>
+          <w:sz w:val="20"/>
+          <w:szCs w:val="20"/>
+        </w:rPr>
+        <w:t xml:space="preserve"> for the ticket's size, else </w:t>
+      </w:r>
+      <w:r>
+        <w:rPr>
+          <w:rFonts w:ascii="Consolas" w:cs="Consolas" w:eastAsia="Consolas" w:hAnsi="Consolas"/>
+          <w:color w:val="1F2A2E"/>
+          <w:sz w:val="18"/>
+          <w:szCs w:val="18"/>
+        </w:rPr>
+        <w:t xml:space="preserve">model</w:t>
+      </w:r>
+      <w:r>
+        <w:rPr>
+          <w:rFonts w:ascii="Calibri" w:cs="Calibri" w:eastAsia="Calibri" w:hAnsi="Calibri"/>
+          <w:color w:val="1F2A2E"/>
+          <w:sz w:val="20"/>
+          <w:szCs w:val="20"/>
+        </w:rPr>
+        <w:t xml:space="preserve">, else </w:t>
+      </w:r>
+      <w:r>
+        <w:rPr>
+          <w:rFonts w:ascii="Consolas" w:cs="Consolas" w:eastAsia="Consolas" w:hAnsi="Consolas"/>
+          <w:color w:val="1F2A2E"/>
+          <w:sz w:val="18"/>
+          <w:szCs w:val="18"/>
+        </w:rPr>
+        <w:t xml:space="preserve">claude-sonnet-5-5-high</w:t>
+      </w:r>
+      <w:r>
+        <w:rPr>
+          <w:rFonts w:ascii="Calibri" w:cs="Calibri" w:eastAsia="Calibri" w:hAnsi="Calibri"/>
+          <w:color w:val="1F2A2E"/>
+          <w:sz w:val="20"/>
+          <w:szCs w:val="20"/>
+        </w:rPr>
+        <w:t xml:space="preserve">. A fix Shuttle (Bugbot finding, red CI, failed acceptance) switches to </w:t>
+      </w:r>
+      <w:r>
+        <w:rPr>
+          <w:rFonts w:ascii="Consolas" w:cs="Consolas" w:eastAsia="Consolas" w:hAnsi="Consolas"/>
+          <w:color w:val="1F2A2E"/>
+          <w:sz w:val="18"/>
+          <w:szCs w:val="18"/>
+        </w:rPr>
+        <w:t xml:space="preserve">fixModel</w:t>
+      </w:r>
+      <w:r>
+        <w:rPr>
+          <w:rFonts w:ascii="Calibri" w:cs="Calibri" w:eastAsia="Calibri" w:hAnsi="Calibri"/>
+          <w:color w:val="1F2A2E"/>
+          <w:sz w:val="20"/>
+          <w:szCs w:val="20"/>
+        </w:rPr>
+        <w:t xml:space="preserve"> from fix round </w:t>
+      </w:r>
+      <w:r>
+        <w:rPr>
+          <w:rFonts w:ascii="Consolas" w:cs="Consolas" w:eastAsia="Consolas" w:hAnsi="Consolas"/>
+          <w:color w:val="1F2A2E"/>
+          <w:sz w:val="18"/>
+          <w:szCs w:val="18"/>
+        </w:rPr>
+        <w:t xml:space="preserve">fixModelAfter</w:t>
+      </w:r>
+      <w:r>
+        <w:rPr>
+          <w:rFonts w:ascii="Calibri" w:cs="Calibri" w:eastAsia="Calibri" w:hAnsi="Calibri"/>
+          <w:color w:val="1F2A2E"/>
+          <w:sz w:val="20"/>
+          <w:szCs w:val="20"/>
+        </w:rPr>
+        <w:t xml:space="preserve"> on, so the first fix runs on the ticket's model and later ones on the stronger model. </w:t>
+      </w:r>
+      <w:r>
+        <w:rPr>
+          <w:rFonts w:ascii="Consolas" w:cs="Consolas" w:eastAsia="Consolas" w:hAnsi="Consolas"/>
+          <w:color w:val="1F2A2E"/>
+          <w:sz w:val="18"/>
+          <w:szCs w:val="18"/>
+        </w:rPr>
+        <w:t xml:space="preserve">/warp-init</w:t>
+      </w:r>
+      <w:r>
+        <w:rPr>
+          <w:rFonts w:ascii="Calibri" w:cs="Calibri" w:eastAsia="Calibri" w:hAnsi="Calibri"/>
+          <w:color w:val="1F2A2E"/>
+          <w:sz w:val="20"/>
+          <w:szCs w:val="20"/>
+        </w:rPr>
+        <w:t xml:space="preserve"> writes the lines commented out; uncomment the ones you want. A trailing </w:t>
+      </w:r>
+      <w:r>
+        <w:rPr>
+          <w:rFonts w:ascii="Consolas" w:cs="Consolas" w:eastAsia="Consolas" w:hAnsi="Consolas"/>
+          <w:color w:val="1F2A2E"/>
+          <w:sz w:val="18"/>
+          <w:szCs w:val="18"/>
+        </w:rPr>
+        <w:t xml:space="preserve"># comment</w:t>
+      </w:r>
+      <w:r>
+        <w:rPr>
+          <w:rFonts w:ascii="Calibri" w:cs="Calibri" w:eastAsia="Calibri" w:hAnsi="Calibri"/>
+          <w:color w:val="1F2A2E"/>
+          <w:sz w:val="20"/>
+          <w:szCs w:val="20"/>
+        </w:rPr>
+        <w:t xml:space="preserve"> is ignored.</w:t>
+      </w:r>
+    </w:p>
+    <w:p>
+      <w:pPr>
+        <w:spacing w:after="0"/>
+        <w:ind w:left="360"/>
+      </w:pPr>
+      <w:r>
+        <w:rPr>
+          <w:rFonts w:ascii="Consolas" w:cs="Consolas" w:eastAsia="Consolas" w:hAnsi="Consolas"/>
+          <w:color w:val="1F2A2E"/>
+          <w:sz w:val="18"/>
+          <w:szCs w:val="18"/>
+        </w:rPr>
+        <w:t xml:space="preserve"># model: claude-sonnet-5-5-high   # the default, as before</w:t>
+      </w:r>
+    </w:p>
+    <w:p>
+      <w:pPr>
+        <w:spacing w:after="0"/>
+        <w:ind w:left="360"/>
+      </w:pPr>
+      <w:r>
+        <w:rPr>
+          <w:rFonts w:ascii="Consolas" w:cs="Consolas" w:eastAsia="Consolas" w:hAnsi="Consolas"/>
+          <w:color w:val="1F2A2E"/>
+          <w:sz w:val="18"/>
+          <w:szCs w:val="18"/>
+        </w:rPr>
+        <w:t xml:space="preserve"># modelS: claude-haiku-5-5        # empty = use model</w:t>
+      </w:r>
+    </w:p>
+    <w:p>
+      <w:pPr>
+        <w:spacing w:after="0"/>
+        <w:ind w:left="360"/>
+      </w:pPr>
+      <w:r>
+        <w:rPr>
+          <w:rFonts w:ascii="Consolas" w:cs="Consolas" w:eastAsia="Consolas" w:hAnsi="Consolas"/>
+          <w:color w:val="1F2A2E"/>
+          <w:sz w:val="18"/>
+          <w:szCs w:val="18"/>
+        </w:rPr>
+        <w:t xml:space="preserve"># modelM: ""</w:t>
+      </w:r>
+    </w:p>
+    <w:p>
+      <w:pPr>
+        <w:spacing w:after="0"/>
+        <w:ind w:left="360"/>
+      </w:pPr>
+      <w:r>
+        <w:rPr>
+          <w:rFonts w:ascii="Consolas" w:cs="Consolas" w:eastAsia="Consolas" w:hAnsi="Consolas"/>
+          <w:color w:val="1F2A2E"/>
+          <w:sz w:val="18"/>
+          <w:szCs w:val="18"/>
+        </w:rPr>
+        <w:t xml:space="preserve"># modelL: ""</w:t>
+      </w:r>
+    </w:p>
+    <w:p>
+      <w:pPr>
+        <w:spacing w:after="0"/>
+        <w:ind w:left="360"/>
+      </w:pPr>
+      <w:r>
+        <w:rPr>
+          <w:rFonts w:ascii="Consolas" w:cs="Consolas" w:eastAsia="Consolas" w:hAnsi="Consolas"/>
+          <w:color w:val="1F2A2E"/>
+          <w:sz w:val="18"/>
+          <w:szCs w:val="18"/>
+        </w:rPr>
+        <w:t xml:space="preserve"># modelXL: claude-opus-5-5</w:t>
+      </w:r>
+    </w:p>
+    <w:p>
+      <w:pPr>
+        <w:spacing w:after="0"/>
+        <w:ind w:left="360"/>
+      </w:pPr>
+      <w:r>
+        <w:rPr>
+          <w:rFonts w:ascii="Consolas" w:cs="Consolas" w:eastAsia="Consolas" w:hAnsi="Consolas"/>
+          <w:color w:val="1F2A2E"/>
+          <w:sz w:val="18"/>
+          <w:szCs w:val="18"/>
+        </w:rPr>
+        <w:t xml:space="preserve"># fixModel: claude-opus-5-5       # empty = keep the ticket's model</w:t>
+      </w:r>
+    </w:p>
+    <w:p>
+      <w:pPr>
+        <w:spacing w:after="0"/>
+        <w:ind w:left="360"/>
+      </w:pPr>
+      <w:r>
+        <w:rPr>
+          <w:rFonts w:ascii="Consolas" w:cs="Consolas" w:eastAsia="Consolas" w:hAnsi="Consolas"/>
+          <w:color w:val="1F2A2E"/>
+          <w:sz w:val="18"/>
+          <w:szCs w:val="18"/>
+        </w:rPr>
+        <w:t xml:space="preserve"># fixModelAfter: 2</w:t>
+      </w:r>
+    </w:p>
+    <w:p>
+      <w:pPr>
+        <w:spacing w:after="60"/>
+      </w:pPr>
+    </w:p>
+    <w:p>
+      <w:pPr>
+        <w:spacing w:after="100" w:line="264"/>
+      </w:pPr>
+      <w:r>
+        <w:rPr>
+          <w:rFonts w:ascii="Consolas" w:cs="Consolas" w:eastAsia="Consolas" w:hAnsi="Consolas"/>
+          <w:color w:val="1F2A2E"/>
+          <w:sz w:val="18"/>
+          <w:szCs w:val="18"/>
+        </w:rPr>
+        <w:t xml:space="preserve">checkout.py launch</w:t>
+      </w:r>
+      <w:r>
+        <w:rPr>
+          <w:rFonts w:ascii="Calibri" w:cs="Calibri" w:eastAsia="Calibri" w:hAnsi="Calibri"/>
+          <w:color w:val="1F2A2E"/>
+          <w:sz w:val="20"/>
+          <w:szCs w:val="20"/>
+        </w:rPr>
+        <w:t xml:space="preserve"> prints </w:t>
+      </w:r>
+      <w:r>
+        <w:rPr>
+          <w:rFonts w:ascii="Consolas" w:cs="Consolas" w:eastAsia="Consolas" w:hAnsi="Consolas"/>
+          <w:color w:val="1F2A2E"/>
+          <w:sz w:val="18"/>
+          <w:szCs w:val="18"/>
+        </w:rPr>
+        <w:t xml:space="preserve">model: &lt;slug&gt; (&lt;why&gt;)</w:t>
+      </w:r>
+      <w:r>
+        <w:rPr>
+          <w:rFonts w:ascii="Calibri" w:cs="Calibri" w:eastAsia="Calibri" w:hAnsi="Calibri"/>
+          <w:color w:val="1F2A2E"/>
+          <w:sz w:val="20"/>
+          <w:szCs w:val="20"/>
+        </w:rPr>
+        <w:t xml:space="preserve"> above the prompt, and the parent starts the subagent with it. The config is read at each launch, so the next Shuttle picks up a change. </w:t>
+      </w:r>
+      <w:r>
+        <w:rPr>
+          <w:rFonts w:ascii="Consolas" w:cs="Consolas" w:eastAsia="Consolas" w:hAnsi="Consolas"/>
+          <w:color w:val="1F2A2E"/>
+          <w:sz w:val="18"/>
+          <w:szCs w:val="18"/>
+        </w:rPr>
+        <w:t xml:space="preserve">warp:retry &lt;id&gt;</w:t>
+      </w:r>
+      <w:r>
+        <w:rPr>
+          <w:rFonts w:ascii="Calibri" w:cs="Calibri" w:eastAsia="Calibri" w:hAnsi="Calibri"/>
+          <w:color w:val="1F2A2E"/>
+          <w:sz w:val="20"/>
+          <w:szCs w:val="20"/>
+        </w:rPr>
+        <w:t xml:space="preserve"> restarts any ticket that is not merged or done: back to </w:t>
+      </w:r>
+      <w:r>
+        <w:rPr>
+          <w:rFonts w:ascii="Consolas" w:cs="Consolas" w:eastAsia="Consolas" w:hAnsi="Consolas"/>
+          <w:color w:val="1F2A2E"/>
+          <w:sz w:val="18"/>
+          <w:szCs w:val="18"/>
+        </w:rPr>
+        <w:t xml:space="preserve">fix</w:t>
+      </w:r>
+      <w:r>
+        <w:rPr>
+          <w:rFonts w:ascii="Calibri" w:cs="Calibri" w:eastAsia="Calibri" w:hAnsi="Calibri"/>
+          <w:color w:val="1F2A2E"/>
+          <w:sz w:val="20"/>
+          <w:szCs w:val="20"/>
+        </w:rPr>
+        <w:t xml:space="preserve"> on its pull request, else </w:t>
+      </w:r>
+      <w:r>
+        <w:rPr>
+          <w:rFonts w:ascii="Consolas" w:cs="Consolas" w:eastAsia="Consolas" w:hAnsi="Consolas"/>
+          <w:color w:val="1F2A2E"/>
+          <w:sz w:val="18"/>
+          <w:szCs w:val="18"/>
+        </w:rPr>
+        <w:t xml:space="preserve">queued</w:t>
+      </w:r>
+      <w:r>
+        <w:rPr>
+          <w:rFonts w:ascii="Calibri" w:cs="Calibri" w:eastAsia="Calibri" w:hAnsi="Calibri"/>
+          <w:color w:val="1F2A2E"/>
+          <w:sz w:val="20"/>
+          <w:szCs w:val="20"/>
+        </w:rPr>
+        <w:t xml:space="preserve">.</w:t>
+      </w:r>
+    </w:p>
     <w:p>
       <w:pPr>
         <w:pStyle w:val="Heading2"/>
@@ -6933,7 +7307,7 @@
         <w:sz w:val="18"/>
         <w:szCs w:val="18"/>
       </w:rPr>
-      <w:t xml:space="preserve">	Operator guide · 1.6.4 </w:t>
+      <w:t xml:space="preserve">	Operator guide · 1.6.5 </w:t>
     </w:r>
   </w:p>
 </w:hdr>

</xml_diff>